<commit_message>
Correct partner name, fill repo URL, rewrite README
</commit_message>
<xml_diff>
--- a/docs/design-document.docx
+++ b/docs/design-document.docx
@@ -99,7 +99,7 @@
           <w:sz w:val="24"/>
           <w:szCs w:val="24"/>
         </w:rPr>
-        <w:t xml:space="preserve">Todd Simonson and Jahnavi [Surname]</w:t>
+        <w:t xml:space="preserve">Todd Simonson and Jahnavi Dammannagari</w:t>
       </w:r>
     </w:p>
     <w:p>
@@ -1472,7 +1472,7 @@
                 <w:sz w:val="20"/>
                 <w:szCs w:val="20"/>
               </w:rPr>
-              <w:t xml:space="preserve">Jahnavi [Surname]</w:t>
+              <w:t xml:space="preserve">Jahnavi Dammannagari</w:t>
             </w:r>
           </w:p>
         </w:tc>
@@ -2710,13 +2710,10 @@
       <w:r>
         <w:rPr>
           <w:rFonts w:ascii="Times New Roman" w:cs="Times New Roman" w:eastAsia="Times New Roman" w:hAnsi="Times New Roman"/>
-          <w:b/>
-          <w:bCs/>
-          <w:color w:val="C4571A"/>
-          <w:sz w:val="24"/>
-          <w:szCs w:val="24"/>
-        </w:rPr>
-        <w:t xml:space="preserve">[PENDING: insert repository URL once created.]</w:t>
+          <w:sz w:val="24"/>
+          <w:szCs w:val="24"/>
+        </w:rPr>
+        <w:t xml:space="preserve">https://github.com/tgsimonson/mscs632-team7-todo</w:t>
       </w:r>
     </w:p>
     <w:p>

</xml_diff>